<commit_message>
Sprint 2: atualizar site e GDD do RotaLiza
</commit_message>
<xml_diff>
--- a/ff331155-6bd2-4a47-b167-c1d65bcddfbe.docx
+++ b/ff331155-6bd2-4a47-b167-c1d65bcddfbe.docx
@@ -1,6 +1,6 @@
 
 <file path=word/document.xml><?xml version="1.0" encoding="utf-8"?>
-<w:document xmlns:wpc="http://schemas.microsoft.com/office/word/2010/wordprocessingCanvas" xmlns:cx="http://schemas.microsoft.com/office/drawing/2014/chartex" xmlns:cx1="http://schemas.microsoft.com/office/drawing/2015/9/8/chartex" xmlns:cx2="http://schemas.microsoft.com/office/drawing/2015/10/21/chartex" xmlns:cx3="http://schemas.microsoft.com/office/drawing/2016/5/9/chartex" xmlns:cx4="http://schemas.microsoft.com/office/drawing/2016/5/10/chartex" xmlns:cx5="http://schemas.microsoft.com/office/drawing/2016/5/11/chartex" xmlns:cx6="http://schemas.microsoft.com/office/drawing/2016/5/12/chartex" xmlns:cx7="http://schemas.microsoft.com/office/drawing/2016/5/13/chartex" xmlns:cx8="http://schemas.microsoft.com/office/drawing/2016/5/14/chartex" xmlns:mc="http://schemas.openxmlformats.org/markup-compatibility/2006" xmlns:aink="http://schemas.microsoft.com/office/drawing/2016/ink" xmlns:am3d="http://schemas.microsoft.com/office/drawing/2017/model3d" xmlns:o="urn:schemas-microsoft-com:office:office" xmlns:oel="http://schemas.microsoft.com/office/2019/extlst" xmlns:r="http://schemas.openxmlformats.org/officeDocument/2006/relationships" xmlns:m="http://schemas.openxmlformats.org/officeDocument/2006/math" xmlns:v="urn:schemas-microsoft-com:vml" xmlns:wp14="http://schemas.microsoft.com/office/word/2010/wordprocessingDrawing" xmlns:wp="http://schemas.openxmlformats.org/drawingml/2006/wordprocessingDrawing" xmlns:w10="urn:schemas-microsoft-com:office:word" xmlns:w="http://schemas.openxmlformats.org/wordprocessingml/2006/main" xmlns:w14="http://schemas.microsoft.com/office/word/2010/wordml" xmlns:w15="http://schemas.microsoft.com/office/word/2012/wordml" xmlns:w16cex="http://schemas.microsoft.com/office/word/2018/wordml/cex" xmlns:w16cid="http://schemas.microsoft.com/office/word/2016/wordml/cid" xmlns:w16="http://schemas.microsoft.com/office/word/2018/wordml" xmlns:w16du="http://schemas.microsoft.com/office/word/2023/wordml/word16du" xmlns:w16sdtdh="http://schemas.microsoft.com/office/word/2020/wordml/sdtdatahash" xmlns:w16sdtfl="http://schemas.microsoft.com/office/word/2024/wordml/sdtformatlock" xmlns:w16se="http://schemas.microsoft.com/office/word/2015/wordml/symex" xmlns:wpg="http://schemas.microsoft.com/office/word/2010/wordprocessingGroup" xmlns:wpi="http://schemas.microsoft.com/office/word/2010/wordprocessingInk" xmlns:wne="http://schemas.microsoft.com/office/word/2006/wordml" xmlns:wps="http://schemas.microsoft.com/office/word/2010/wordprocessingShape" mc:Ignorable="w14 w15 w16se w16cid w16 w16cex w16sdtdh w16sdtfl w16du wp14">
+<w:document xmlns:wpc="http://schemas.microsoft.com/office/word/2010/wordprocessingCanvas" xmlns:cx="http://schemas.microsoft.com/office/drawing/2014/chartex" xmlns:cx1="http://schemas.microsoft.com/office/drawing/2015/9/8/chartex" xmlns:cx2="http://schemas.microsoft.com/office/drawing/2015/10/21/chartex" xmlns:cx3="http://schemas.microsoft.com/office/drawing/2016/5/9/chartex" xmlns:cx4="http://schemas.microsoft.com/office/drawing/2016/5/10/chartex" xmlns:cx5="http://schemas.microsoft.com/office/drawing/2016/5/11/chartex" xmlns:cx6="http://schemas.microsoft.com/office/drawing/2016/5/12/chartex" xmlns:cx7="http://schemas.microsoft.com/office/drawing/2016/5/13/chartex" xmlns:cx8="http://schemas.microsoft.com/office/drawing/2016/5/14/chartex" xmlns:mc="http://schemas.openxmlformats.org/markup-compatibility/2006" xmlns:aink="http://schemas.microsoft.com/office/drawing/2016/ink" xmlns:am3d="http://schemas.microsoft.com/office/drawing/2017/model3d" xmlns:o="urn:schemas-microsoft-com:office:office" xmlns:oel="http://schemas.microsoft.com/office/2019/extlst" xmlns:r="http://schemas.openxmlformats.org/officeDocument/2006/relationships" xmlns:m="http://schemas.openxmlformats.org/officeDocument/2006/math" xmlns:v="urn:schemas-microsoft-com:vml" xmlns:wp14="http://schemas.microsoft.com/office/word/2010/wordprocessingDrawing" xmlns:wp="http://schemas.openxmlformats.org/drawingml/2006/wordprocessingDrawing" xmlns:w10="urn:schemas-microsoft-com:office:word" xmlns:w="http://schemas.openxmlformats.org/wordprocessingml/2006/main" xmlns:w14="http://schemas.microsoft.com/office/word/2010/wordml" xmlns:w15="http://schemas.microsoft.com/office/word/2012/wordml" xmlns:w16cex="http://schemas.microsoft.com/office/word/2018/wordml/cex" xmlns:w16cid="http://schemas.microsoft.com/office/word/2016/wordml/cid" xmlns:w16="http://schemas.microsoft.com/office/word/2018/wordml" xmlns:w16sdtdh="http://schemas.microsoft.com/office/word/2020/wordml/sdtdatahash" xmlns:w16se="http://schemas.microsoft.com/office/word/2015/wordml/symex" xmlns:wpg="http://schemas.microsoft.com/office/word/2010/wordprocessingGroup" xmlns:wpi="http://schemas.microsoft.com/office/word/2010/wordprocessingInk" xmlns:wne="http://schemas.microsoft.com/office/word/2006/wordml" xmlns:wps="http://schemas.microsoft.com/office/word/2010/wordprocessingShape" mc:Ignorable="w14 w15 w16se w16cid w16 w16cex w16sdtdh wp14">
   <w:body>
     <w:p>
       <w:pPr>
@@ -41,7 +41,35 @@
           <w:lang w:eastAsia="pt-BR"/>
           <w14:ligatures w14:val="none"/>
         </w:rPr>
-        <w:t xml:space="preserve"> Game Design Document (GDD)</w:t>
+        <w:t xml:space="preserve"> Game Design </w:t>
+      </w:r>
+      <w:proofErr w:type="spellStart"/>
+      <w:r>
+        <w:rPr>
+          <w:rFonts w:ascii="Arial" w:eastAsia="Times New Roman" w:hAnsi="Arial" w:cs="Arial"/>
+          <w:b/>
+          <w:bCs/>
+          <w:kern w:val="36"/>
+          <w:sz w:val="48"/>
+          <w:szCs w:val="48"/>
+          <w:lang w:eastAsia="pt-BR"/>
+          <w14:ligatures w14:val="none"/>
+        </w:rPr>
+        <w:t>Document</w:t>
+      </w:r>
+      <w:proofErr w:type="spellEnd"/>
+      <w:r>
+        <w:rPr>
+          <w:rFonts w:ascii="Arial" w:eastAsia="Times New Roman" w:hAnsi="Arial" w:cs="Arial"/>
+          <w:b/>
+          <w:bCs/>
+          <w:kern w:val="36"/>
+          <w:sz w:val="48"/>
+          <w:szCs w:val="48"/>
+          <w:lang w:eastAsia="pt-BR"/>
+          <w14:ligatures w14:val="none"/>
+        </w:rPr>
+        <w:t xml:space="preserve"> (GDD)</w:t>
       </w:r>
     </w:p>
     <w:p>
@@ -97,6 +125,44 @@
       <w:r>
         <w:rPr>
           <w:rFonts w:ascii="Arial" w:eastAsia="Times New Roman" w:hAnsi="Arial" w:cs="Arial"/>
+          <w:b/>
+          <w:bCs/>
+          <w:kern w:val="0"/>
+          <w:lang w:eastAsia="pt-BR"/>
+          <w14:ligatures w14:val="none"/>
+        </w:rPr>
+        <w:t xml:space="preserve"> </w:t>
+      </w:r>
+      <w:r>
+        <w:rPr>
+          <w:rFonts w:ascii="Arial" w:eastAsia="Times New Roman" w:hAnsi="Arial" w:cs="Arial"/>
+          <w:kern w:val="0"/>
+          <w:lang w:eastAsia="pt-BR"/>
+          <w14:ligatures w14:val="none"/>
+        </w:rPr>
+        <w:t>Rota</w:t>
+      </w:r>
+      <w:r>
+        <w:rPr>
+          <w:rFonts w:ascii="Arial" w:eastAsia="Times New Roman" w:hAnsi="Arial" w:cs="Arial"/>
+          <w:kern w:val="0"/>
+          <w:lang w:eastAsia="pt-BR"/>
+          <w14:ligatures w14:val="none"/>
+        </w:rPr>
+        <w:t xml:space="preserve"> F</w:t>
+      </w:r>
+      <w:r>
+        <w:rPr>
+          <w:rFonts w:ascii="Arial" w:eastAsia="Times New Roman" w:hAnsi="Arial" w:cs="Arial"/>
+          <w:kern w:val="0"/>
+          <w:lang w:eastAsia="pt-BR"/>
+          <w14:ligatures w14:val="none"/>
+        </w:rPr>
+        <w:t>ácil</w:t>
+      </w:r>
+      <w:r>
+        <w:rPr>
+          <w:rFonts w:ascii="Arial" w:eastAsia="Times New Roman" w:hAnsi="Arial" w:cs="Arial"/>
           <w:kern w:val="0"/>
           <w:lang w:eastAsia="pt-BR"/>
           <w14:ligatures w14:val="none"/>
@@ -121,7 +187,16 @@
           <w:lang w:eastAsia="pt-BR"/>
           <w14:ligatures w14:val="none"/>
         </w:rPr>
-        <w:t xml:space="preserve"> (Ex: Plataforma, RPG, FPS, Puzzle)</w:t>
+        <w:t xml:space="preserve"> </w:t>
+      </w:r>
+      <w:r>
+        <w:rPr>
+          <w:rFonts w:ascii="Arial" w:eastAsia="Times New Roman" w:hAnsi="Arial" w:cs="Arial"/>
+          <w:kern w:val="0"/>
+          <w:lang w:eastAsia="pt-BR"/>
+          <w14:ligatures w14:val="none"/>
+        </w:rPr>
+        <w:t>Simulador</w:t>
       </w:r>
       <w:r>
         <w:rPr>
@@ -150,7 +225,16 @@
           <w:lang w:eastAsia="pt-BR"/>
           <w14:ligatures w14:val="none"/>
         </w:rPr>
-        <w:t xml:space="preserve"> (PC, Mobile, Web, Console)</w:t>
+        <w:t xml:space="preserve"> </w:t>
+      </w:r>
+      <w:r>
+        <w:rPr>
+          <w:rFonts w:ascii="Arial" w:eastAsia="Times New Roman" w:hAnsi="Arial" w:cs="Arial"/>
+          <w:kern w:val="0"/>
+          <w:lang w:eastAsia="pt-BR"/>
+          <w14:ligatures w14:val="none"/>
+        </w:rPr>
+        <w:t>Web</w:t>
       </w:r>
       <w:r>
         <w:rPr>
@@ -175,6 +259,26 @@
       <w:r>
         <w:rPr>
           <w:rFonts w:ascii="Arial" w:eastAsia="Times New Roman" w:hAnsi="Arial" w:cs="Arial"/>
+          <w:b/>
+          <w:bCs/>
+          <w:kern w:val="0"/>
+          <w:lang w:eastAsia="pt-BR"/>
+          <w14:ligatures w14:val="none"/>
+        </w:rPr>
+        <w:t xml:space="preserve"> </w:t>
+      </w:r>
+      <w:r>
+        <w:rPr>
+          <w:rFonts w:ascii="Arial" w:eastAsia="Times New Roman" w:hAnsi="Arial" w:cs="Arial"/>
+          <w:kern w:val="0"/>
+          <w:lang w:eastAsia="pt-BR"/>
+          <w14:ligatures w14:val="none"/>
+        </w:rPr>
+        <w:t>Pessoas</w:t>
+      </w:r>
+      <w:r>
+        <w:rPr>
+          <w:rFonts w:ascii="Arial" w:eastAsia="Times New Roman" w:hAnsi="Arial" w:cs="Arial"/>
           <w:kern w:val="0"/>
           <w:lang w:eastAsia="pt-BR"/>
           <w14:ligatures w14:val="none"/>
@@ -195,12 +299,31 @@
       <w:r>
         <w:rPr>
           <w:rFonts w:ascii="Arial" w:eastAsia="Times New Roman" w:hAnsi="Arial" w:cs="Arial"/>
-          <w:kern w:val="0"/>
-          <w:lang w:eastAsia="pt-BR"/>
-          <w14:ligatures w14:val="none"/>
-        </w:rPr>
-        <w:br/>
-        <w:t>Descreva em 3 a 5 linhas a ideia principal do jogo, objetivo e experiência esperada.</w:t>
+          <w:b/>
+          <w:bCs/>
+          <w:kern w:val="0"/>
+          <w:lang w:eastAsia="pt-BR"/>
+          <w14:ligatures w14:val="none"/>
+        </w:rPr>
+        <w:t xml:space="preserve"> </w:t>
+      </w:r>
+      <w:r>
+        <w:rPr>
+          <w:rFonts w:ascii="Arial" w:eastAsia="Times New Roman" w:hAnsi="Arial" w:cs="Arial"/>
+          <w:kern w:val="0"/>
+          <w:lang w:eastAsia="pt-BR"/>
+          <w14:ligatures w14:val="none"/>
+        </w:rPr>
+        <w:t xml:space="preserve">Fabio em sua missão diária de buscar e devolver </w:t>
+      </w:r>
+      <w:r>
+        <w:rPr>
+          <w:rFonts w:ascii="Arial" w:eastAsia="Times New Roman" w:hAnsi="Arial" w:cs="Arial"/>
+          <w:kern w:val="0"/>
+          <w:lang w:eastAsia="pt-BR"/>
+          <w14:ligatures w14:val="none"/>
+        </w:rPr>
+        <w:t>universitários, com objetivo de gastar o mínimo de combustível e tempo, com uma experiência desafiadora.</w:t>
       </w:r>
     </w:p>
     <w:p>
@@ -221,7 +344,7 @@
           <w:lang w:eastAsia="pt-BR"/>
         </w:rPr>
         <w:pict w14:anchorId="31354CD7">
-          <v:rect id="_x0000_i1030" alt="" style="width:425.2pt;height:.05pt;mso-width-percent:0;mso-height-percent:0;mso-width-percent:0;mso-height-percent:0" o:hralign="center" o:hrstd="t" o:hr="t" fillcolor="#a0a0a0" stroked="f"/>
+          <v:rect id="_x0000_i1025" alt="" style="width:425.2pt;height:.05pt;mso-width-percent:0;mso-height-percent:0;mso-width-percent:0;mso-height-percent:0" o:hralign="center" o:hrstd="t" o:hr="t" fillcolor="#a0a0a0" stroked="f"/>
         </w:pict>
       </w:r>
     </w:p>
@@ -271,7 +394,61 @@
           <w:lang w:eastAsia="pt-BR"/>
           <w14:ligatures w14:val="none"/>
         </w:rPr>
-        <w:t>Como você atende a persona com o jogo</w:t>
+        <w:t xml:space="preserve">Fabio </w:t>
+      </w:r>
+      <w:r>
+        <w:rPr>
+          <w:rFonts w:ascii="Arial" w:eastAsia="Times New Roman" w:hAnsi="Arial" w:cs="Arial"/>
+          <w:kern w:val="0"/>
+          <w:lang w:eastAsia="pt-BR"/>
+          <w14:ligatures w14:val="none"/>
+        </w:rPr>
+        <w:t>o piloto da van á</w:t>
+      </w:r>
+      <w:r>
+        <w:rPr>
+          <w:rFonts w:ascii="Arial" w:eastAsia="Times New Roman" w:hAnsi="Arial" w:cs="Arial"/>
+          <w:kern w:val="0"/>
+          <w:lang w:eastAsia="pt-BR"/>
+          <w14:ligatures w14:val="none"/>
+        </w:rPr>
+        <w:t xml:space="preserve"> dirige </w:t>
+      </w:r>
+      <w:r>
+        <w:rPr>
+          <w:rFonts w:ascii="Arial" w:eastAsia="Times New Roman" w:hAnsi="Arial" w:cs="Arial"/>
+          <w:kern w:val="0"/>
+          <w:lang w:eastAsia="pt-BR"/>
+          <w14:ligatures w14:val="none"/>
+        </w:rPr>
+        <w:t xml:space="preserve">pela cidade buscando e entregando os </w:t>
+      </w:r>
+      <w:r>
+        <w:rPr>
+          <w:rFonts w:ascii="Arial" w:eastAsia="Times New Roman" w:hAnsi="Arial" w:cs="Arial"/>
+          <w:kern w:val="0"/>
+          <w:lang w:eastAsia="pt-BR"/>
+          <w14:ligatures w14:val="none"/>
+        </w:rPr>
+        <w:t xml:space="preserve">universitários </w:t>
+      </w:r>
+      <w:r>
+        <w:rPr>
+          <w:rFonts w:ascii="Arial" w:eastAsia="Times New Roman" w:hAnsi="Arial" w:cs="Arial"/>
+          <w:kern w:val="0"/>
+          <w:lang w:eastAsia="pt-BR"/>
+          <w14:ligatures w14:val="none"/>
+        </w:rPr>
+        <w:t>pelas melhores rotas sem esgotar o combustível e vencendo o cansaço da rotina</w:t>
+      </w:r>
+      <w:r>
+        <w:rPr>
+          <w:rFonts w:ascii="Arial" w:eastAsia="Times New Roman" w:hAnsi="Arial" w:cs="Arial"/>
+          <w:kern w:val="0"/>
+          <w:lang w:eastAsia="pt-BR"/>
+          <w14:ligatures w14:val="none"/>
+        </w:rPr>
+        <w:t>.</w:t>
       </w:r>
     </w:p>
     <w:p>
@@ -292,7 +469,7 @@
           <w:lang w:eastAsia="pt-BR"/>
         </w:rPr>
         <w:pict w14:anchorId="0C7E97B2">
-          <v:rect id="_x0000_i1029" alt="" style="width:425.2pt;height:.05pt;mso-width-percent:0;mso-height-percent:0;mso-width-percent:0;mso-height-percent:0" o:hralign="center" o:hrstd="t" o:hr="t" fillcolor="#a0a0a0" stroked="f"/>
+          <v:rect id="_x0000_i1026" alt="" style="width:425.2pt;height:.05pt;mso-width-percent:0;mso-height-percent:0;mso-width-percent:0;mso-height-percent:0" o:hralign="center" o:hrstd="t" o:hr="t" fillcolor="#a0a0a0" stroked="f"/>
         </w:pict>
       </w:r>
     </w:p>
@@ -366,8 +543,25 @@
           <w:lang w:eastAsia="pt-BR"/>
           <w14:ligatures w14:val="none"/>
         </w:rPr>
-        <w:br/>
-        <w:t>O que o jogador precisa fazer para vencer?</w:t>
+        <w:t xml:space="preserve"> O jogador deve fazer o melhor e mais curto percurso com os universitários no mínimo de tempo possível para que Fabio não </w:t>
+      </w:r>
+      <w:r>
+        <w:rPr>
+          <w:rFonts w:ascii="Arial" w:eastAsia="Times New Roman" w:hAnsi="Arial" w:cs="Arial"/>
+          <w:kern w:val="0"/>
+          <w:lang w:eastAsia="pt-BR"/>
+          <w14:ligatures w14:val="none"/>
+        </w:rPr>
+        <w:t>adormeça</w:t>
+      </w:r>
+      <w:r>
+        <w:rPr>
+          <w:rFonts w:ascii="Arial" w:eastAsia="Times New Roman" w:hAnsi="Arial" w:cs="Arial"/>
+          <w:kern w:val="0"/>
+          <w:lang w:eastAsia="pt-BR"/>
+          <w14:ligatures w14:val="none"/>
+        </w:rPr>
+        <w:t xml:space="preserve"> e para que o combustível não acabe.</w:t>
       </w:r>
     </w:p>
     <w:p>
@@ -413,7 +607,16 @@
           <w:lang w:eastAsia="pt-BR"/>
           <w14:ligatures w14:val="none"/>
         </w:rPr>
-        <w:t xml:space="preserve">Movimento (andar, pular, correr…) </w:t>
+        <w:t>Movimento</w:t>
+      </w:r>
+      <w:r>
+        <w:rPr>
+          <w:rFonts w:ascii="Arial" w:eastAsia="Times New Roman" w:hAnsi="Arial" w:cs="Arial"/>
+          <w:kern w:val="0"/>
+          <w:lang w:eastAsia="pt-BR"/>
+          <w14:ligatures w14:val="none"/>
+        </w:rPr>
+        <w:t xml:space="preserve">: Dirigir a Van </w:t>
       </w:r>
     </w:p>
     <w:p>
@@ -437,7 +640,16 @@
           <w:lang w:eastAsia="pt-BR"/>
           <w14:ligatures w14:val="none"/>
         </w:rPr>
-        <w:t xml:space="preserve">Interação (coletar itens, atacar, dialogar…) </w:t>
+        <w:t>Interação</w:t>
+      </w:r>
+      <w:r>
+        <w:rPr>
+          <w:rFonts w:ascii="Arial" w:eastAsia="Times New Roman" w:hAnsi="Arial" w:cs="Arial"/>
+          <w:kern w:val="0"/>
+          <w:lang w:eastAsia="pt-BR"/>
+          <w14:ligatures w14:val="none"/>
+        </w:rPr>
+        <w:t>: Buscar e devolver os universitários.</w:t>
       </w:r>
     </w:p>
     <w:p>
@@ -461,11 +673,48 @@
           <w:lang w:eastAsia="pt-BR"/>
           <w14:ligatures w14:val="none"/>
         </w:rPr>
-        <w:t xml:space="preserve">Sistema de progressão (níveis, pontos, upgrades…) </w:t>
-      </w:r>
-    </w:p>
-    <w:p>
-      <w:pPr>
+        <w:t>Sistema de progressão</w:t>
+      </w:r>
+      <w:r>
+        <w:rPr>
+          <w:rFonts w:ascii="Arial" w:eastAsia="Times New Roman" w:hAnsi="Arial" w:cs="Arial"/>
+          <w:kern w:val="0"/>
+          <w:lang w:eastAsia="pt-BR"/>
+          <w14:ligatures w14:val="none"/>
+        </w:rPr>
+        <w:t>:</w:t>
+      </w:r>
+      <w:r>
+        <w:rPr>
+          <w:rFonts w:ascii="Arial" w:eastAsia="Times New Roman" w:hAnsi="Arial" w:cs="Arial"/>
+          <w:kern w:val="0"/>
+          <w:lang w:eastAsia="pt-BR"/>
+          <w14:ligatures w14:val="none"/>
+        </w:rPr>
+        <w:t xml:space="preserve"> Acabar o combustível </w:t>
+      </w:r>
+    </w:p>
+    <w:p>
+      <w:pPr>
+        <w:numPr>
+          <w:ilvl w:val="0"/>
+          <w:numId w:val="1"/>
+        </w:numPr>
+        <w:spacing w:before="100" w:beforeAutospacing="1" w:after="100" w:afterAutospacing="1" w:line="240" w:lineRule="auto"/>
+        <w:rPr>
+          <w:rFonts w:ascii="Arial" w:eastAsia="Times New Roman" w:hAnsi="Arial" w:cs="Arial"/>
+          <w:kern w:val="0"/>
+          <w:lang w:eastAsia="pt-BR"/>
+          <w14:ligatures w14:val="none"/>
+        </w:rPr>
+      </w:pPr>
+    </w:p>
+    <w:p>
+      <w:pPr>
+        <w:numPr>
+          <w:ilvl w:val="0"/>
+          <w:numId w:val="1"/>
+        </w:numPr>
         <w:spacing w:before="100" w:beforeAutospacing="1" w:after="100" w:afterAutospacing="1" w:line="240" w:lineRule="auto"/>
         <w:rPr>
           <w:rFonts w:ascii="Arial" w:eastAsia="Times New Roman" w:hAnsi="Arial" w:cs="Arial"/>
@@ -509,6 +758,15 @@
         </w:rPr>
         <w:t xml:space="preserve">Condição de vitória: </w:t>
       </w:r>
+      <w:r>
+        <w:rPr>
+          <w:rFonts w:ascii="Arial" w:eastAsia="Times New Roman" w:hAnsi="Arial" w:cs="Arial"/>
+          <w:kern w:val="0"/>
+          <w:lang w:eastAsia="pt-BR"/>
+          <w14:ligatures w14:val="none"/>
+        </w:rPr>
+        <w:t>O jogador consegue fazer todas as rotas sem dormir no caminho, e sem esgotar o combustível.</w:t>
+      </w:r>
     </w:p>
     <w:p>
       <w:pPr>
@@ -533,6 +791,15 @@
         </w:rPr>
         <w:t xml:space="preserve">Condição de derrota: </w:t>
       </w:r>
+      <w:r>
+        <w:rPr>
+          <w:rFonts w:ascii="Arial" w:eastAsia="Times New Roman" w:hAnsi="Arial" w:cs="Arial"/>
+          <w:kern w:val="0"/>
+          <w:lang w:eastAsia="pt-BR"/>
+          <w14:ligatures w14:val="none"/>
+        </w:rPr>
+        <w:t>o jogador pega as rotas mais longas e acaba exausto e dorme, ou esgota o combustível.</w:t>
+      </w:r>
     </w:p>
     <w:p>
       <w:pPr>
@@ -552,7 +819,7 @@
           <w:lang w:eastAsia="pt-BR"/>
         </w:rPr>
         <w:pict w14:anchorId="5F2BDA86">
-          <v:rect id="_x0000_i1028" alt="" style="width:425.2pt;height:.05pt;mso-width-percent:0;mso-height-percent:0;mso-width-percent:0;mso-height-percent:0" o:hralign="center" o:hrstd="t" o:hr="t" fillcolor="#a0a0a0" stroked="f"/>
+          <v:rect id="_x0000_i1027" alt="" style="width:425.2pt;height:.05pt;mso-width-percent:0;mso-height-percent:0;mso-width-percent:0;mso-height-percent:0" o:hralign="center" o:hrstd="t" o:hr="t" fillcolor="#a0a0a0" stroked="f"/>
         </w:pict>
       </w:r>
     </w:p>
@@ -626,19 +893,114 @@
           <w:lang w:eastAsia="pt-BR"/>
           <w14:ligatures w14:val="none"/>
         </w:rPr>
-        <w:br/>
-        <w:t>Resumo da narrativa (início, conflito e objetivo).</w:t>
+        <w:t xml:space="preserve"> </w:t>
+      </w:r>
+      <w:r>
+        <w:rPr>
+          <w:rFonts w:ascii="Arial" w:eastAsia="Times New Roman" w:hAnsi="Arial" w:cs="Arial"/>
+          <w:kern w:val="0"/>
+          <w:lang w:eastAsia="pt-BR"/>
+          <w14:ligatures w14:val="none"/>
+        </w:rPr>
+        <w:t>A</w:t>
+      </w:r>
+      <w:r>
+        <w:rPr>
+          <w:rFonts w:ascii="Arial" w:eastAsia="Times New Roman" w:hAnsi="Arial" w:cs="Arial"/>
+          <w:kern w:val="0"/>
+          <w:lang w:eastAsia="pt-BR"/>
+          <w14:ligatures w14:val="none"/>
+        </w:rPr>
+        <w:t xml:space="preserve"> </w:t>
+      </w:r>
+      <w:r>
+        <w:rPr>
+          <w:rFonts w:ascii="Arial" w:eastAsia="Times New Roman" w:hAnsi="Arial" w:cs="Arial"/>
+          <w:kern w:val="0"/>
+          <w:lang w:eastAsia="pt-BR"/>
+          <w14:ligatures w14:val="none"/>
+        </w:rPr>
+        <w:t>partir das 18:00 Fa</w:t>
+      </w:r>
+      <w:r>
+        <w:rPr>
+          <w:rFonts w:ascii="Arial" w:eastAsia="Times New Roman" w:hAnsi="Arial" w:cs="Arial"/>
+          <w:kern w:val="0"/>
+          <w:lang w:eastAsia="pt-BR"/>
+          <w14:ligatures w14:val="none"/>
+        </w:rPr>
+        <w:t>b</w:t>
+      </w:r>
+      <w:r>
+        <w:rPr>
+          <w:rFonts w:ascii="Arial" w:eastAsia="Times New Roman" w:hAnsi="Arial" w:cs="Arial"/>
+          <w:kern w:val="0"/>
+          <w:lang w:eastAsia="pt-BR"/>
+          <w14:ligatures w14:val="none"/>
+        </w:rPr>
+        <w:t xml:space="preserve">io inicia seu compromisso diário </w:t>
+      </w:r>
+      <w:proofErr w:type="gramStart"/>
+      <w:r>
+        <w:rPr>
+          <w:rFonts w:ascii="Arial" w:eastAsia="Times New Roman" w:hAnsi="Arial" w:cs="Arial"/>
+          <w:kern w:val="0"/>
+          <w:lang w:eastAsia="pt-BR"/>
+          <w14:ligatures w14:val="none"/>
+        </w:rPr>
+        <w:t>de Buscar</w:t>
+      </w:r>
+      <w:proofErr w:type="gramEnd"/>
+      <w:r>
+        <w:rPr>
+          <w:rFonts w:ascii="Arial" w:eastAsia="Times New Roman" w:hAnsi="Arial" w:cs="Arial"/>
+          <w:kern w:val="0"/>
+          <w:lang w:eastAsia="pt-BR"/>
+          <w14:ligatures w14:val="none"/>
+        </w:rPr>
+        <w:t xml:space="preserve"> todos os universitários em suas casas, e </w:t>
+      </w:r>
+      <w:r>
+        <w:rPr>
+          <w:rFonts w:ascii="Arial" w:eastAsia="Times New Roman" w:hAnsi="Arial" w:cs="Arial"/>
+          <w:kern w:val="0"/>
+          <w:lang w:eastAsia="pt-BR"/>
+          <w14:ligatures w14:val="none"/>
+        </w:rPr>
+        <w:t xml:space="preserve">como </w:t>
+      </w:r>
+      <w:r>
+        <w:rPr>
+          <w:rFonts w:ascii="Arial" w:eastAsia="Times New Roman" w:hAnsi="Arial" w:cs="Arial"/>
+          <w:kern w:val="0"/>
+          <w:lang w:eastAsia="pt-BR"/>
+          <w14:ligatures w14:val="none"/>
+        </w:rPr>
+        <w:t>F</w:t>
+      </w:r>
+      <w:r>
+        <w:rPr>
+          <w:rFonts w:ascii="Arial" w:eastAsia="Times New Roman" w:hAnsi="Arial" w:cs="Arial"/>
+          <w:kern w:val="0"/>
+          <w:lang w:eastAsia="pt-BR"/>
+          <w14:ligatures w14:val="none"/>
+        </w:rPr>
+        <w:t xml:space="preserve">abio tem problemas de </w:t>
+      </w:r>
+      <w:r>
+        <w:rPr>
+          <w:rFonts w:ascii="Arial" w:eastAsia="Times New Roman" w:hAnsi="Arial" w:cs="Arial"/>
+          <w:kern w:val="0"/>
+          <w:lang w:eastAsia="pt-BR"/>
+          <w14:ligatures w14:val="none"/>
+        </w:rPr>
+        <w:lastRenderedPageBreak/>
+        <w:t>confusão mental devido ao cansaço extremo e precisa de ajuda para fazer as rotas mais eficientes e não ficar parado na estrada por falta de combustível ou por ser vencido pelo cansaço e a narcolepsia.</w:t>
       </w:r>
     </w:p>
     <w:p>
       <w:pPr>
         <w:spacing w:before="100" w:beforeAutospacing="1" w:after="100" w:afterAutospacing="1" w:line="240" w:lineRule="auto"/>
-        <w:rPr>
-          <w:rFonts w:ascii="Arial" w:eastAsia="Times New Roman" w:hAnsi="Arial" w:cs="Arial"/>
-          <w:kern w:val="0"/>
-          <w:lang w:eastAsia="pt-BR"/>
-          <w14:ligatures w14:val="none"/>
-        </w:rPr>
       </w:pPr>
       <w:r>
         <w:rPr>
@@ -658,8 +1020,10 @@
           <w:lang w:eastAsia="pt-BR"/>
           <w14:ligatures w14:val="none"/>
         </w:rPr>
-        <w:br/>
-        <w:t>Onde o jogo acontece? (Ex: mundo futurista, medieval, espaço…)</w:t>
+        <w:t xml:space="preserve"> O jogo se passa </w:t>
+      </w:r>
+      <w:r>
+        <w:t>em uma cidade urbanizada.</w:t>
       </w:r>
     </w:p>
     <w:p>
@@ -705,8 +1069,16 @@
           <w:lang w:eastAsia="pt-BR"/>
           <w14:ligatures w14:val="none"/>
         </w:rPr>
-        <w:lastRenderedPageBreak/>
-        <w:t xml:space="preserve">Nome + breve descrição </w:t>
+        <w:t>Fabio o Protagonista que pilota a van pelas ruas da cidade.</w:t>
+      </w:r>
+      <w:r>
+        <w:rPr>
+          <w:rFonts w:ascii="Arial" w:eastAsia="Times New Roman" w:hAnsi="Arial" w:cs="Arial"/>
+          <w:kern w:val="0"/>
+          <w:lang w:eastAsia="pt-BR"/>
+          <w14:ligatures w14:val="none"/>
+        </w:rPr>
+        <w:t xml:space="preserve"> </w:t>
       </w:r>
     </w:p>
     <w:p>
@@ -730,7 +1102,16 @@
           <w:lang w:eastAsia="pt-BR"/>
           <w14:ligatures w14:val="none"/>
         </w:rPr>
-        <w:t xml:space="preserve">Papel no jogo </w:t>
+        <w:t>Sua missão é buscar e entregar os universitários em segurança sem adormecer nem esgotar o combustível.</w:t>
+      </w:r>
+      <w:r>
+        <w:rPr>
+          <w:rFonts w:ascii="Arial" w:eastAsia="Times New Roman" w:hAnsi="Arial" w:cs="Arial"/>
+          <w:kern w:val="0"/>
+          <w:lang w:eastAsia="pt-BR"/>
+          <w14:ligatures w14:val="none"/>
+        </w:rPr>
+        <w:t xml:space="preserve"> </w:t>
       </w:r>
     </w:p>
     <w:p>
@@ -751,7 +1132,7 @@
           <w:lang w:eastAsia="pt-BR"/>
         </w:rPr>
         <w:pict w14:anchorId="74B2C2E1">
-          <v:rect id="_x0000_i1027" alt="" style="width:425.2pt;height:.05pt;mso-width-percent:0;mso-height-percent:0;mso-width-percent:0;mso-height-percent:0" o:hralign="center" o:hrstd="t" o:hr="t" fillcolor="#a0a0a0" stroked="f"/>
+          <v:rect id="_x0000_i1028" alt="" style="width:425.2pt;height:.05pt;mso-width-percent:0;mso-height-percent:0;mso-width-percent:0;mso-height-percent:0" o:hralign="center" o:hrstd="t" o:hr="t" fillcolor="#a0a0a0" stroked="f"/>
         </w:pict>
       </w:r>
     </w:p>
@@ -825,18 +1206,48 @@
           <w:lang w:eastAsia="pt-BR"/>
           <w14:ligatures w14:val="none"/>
         </w:rPr>
+        <w:t xml:space="preserve"> Dirigir a van pela cidade coletando alunos e passando por diversas ruas da cidade</w:t>
+      </w:r>
+    </w:p>
+    <w:p>
+      <w:pPr>
+        <w:spacing w:before="100" w:beforeAutospacing="1" w:after="100" w:afterAutospacing="1" w:line="240" w:lineRule="auto"/>
+        <w:rPr>
+          <w:rFonts w:ascii="Arial" w:eastAsia="Times New Roman" w:hAnsi="Arial" w:cs="Arial"/>
+          <w:kern w:val="0"/>
+          <w:lang w:eastAsia="pt-BR"/>
+          <w14:ligatures w14:val="none"/>
+        </w:rPr>
+      </w:pPr>
+      <w:r>
+        <w:rPr>
+          <w:rFonts w:ascii="Arial" w:eastAsia="Times New Roman" w:hAnsi="Arial" w:cs="Arial"/>
+          <w:b/>
+          <w:bCs/>
+          <w:kern w:val="0"/>
+          <w:lang w:eastAsia="pt-BR"/>
+          <w14:ligatures w14:val="none"/>
+        </w:rPr>
+        <w:t>Nível de dificuldade:</w:t>
+      </w:r>
+      <w:r>
+        <w:rPr>
+          <w:rFonts w:ascii="Arial" w:eastAsia="Times New Roman" w:hAnsi="Arial" w:cs="Arial"/>
+          <w:kern w:val="0"/>
+          <w:lang w:eastAsia="pt-BR"/>
+          <w14:ligatures w14:val="none"/>
+        </w:rPr>
         <w:br/>
-        <w:t>O que o jogador faz repetidamente?</w:t>
-      </w:r>
-      <w:r>
-        <w:rPr>
-          <w:rFonts w:ascii="Arial" w:eastAsia="Times New Roman" w:hAnsi="Arial" w:cs="Arial"/>
-          <w:kern w:val="0"/>
-          <w:lang w:eastAsia="pt-BR"/>
-          <w14:ligatures w14:val="none"/>
-        </w:rPr>
-        <w:br/>
-        <w:t>(Ex: explorar → coletar → enfrentar inimigos → evoluir)</w:t>
+        <w:t xml:space="preserve">(Fácil, </w:t>
+      </w:r>
+      <w:r>
+        <w:rPr>
+          <w:rFonts w:ascii="Arial" w:eastAsia="Times New Roman" w:hAnsi="Arial" w:cs="Arial"/>
+          <w:kern w:val="0"/>
+          <w:lang w:eastAsia="pt-BR"/>
+          <w14:ligatures w14:val="none"/>
+        </w:rPr>
+        <w:t>médio, difícil.)</w:t>
       </w:r>
     </w:p>
     <w:p>
@@ -858,49 +1269,18 @@
           <w:lang w:eastAsia="pt-BR"/>
           <w14:ligatures w14:val="none"/>
         </w:rPr>
-        <w:t>Nível de dificuldade:</w:t>
-      </w:r>
-      <w:r>
-        <w:rPr>
-          <w:rFonts w:ascii="Arial" w:eastAsia="Times New Roman" w:hAnsi="Arial" w:cs="Arial"/>
-          <w:kern w:val="0"/>
-          <w:lang w:eastAsia="pt-BR"/>
-          <w14:ligatures w14:val="none"/>
-        </w:rPr>
-        <w:br/>
-        <w:t>(Fácil, progressivo, desafiador…)</w:t>
-      </w:r>
-    </w:p>
-    <w:p>
-      <w:pPr>
-        <w:spacing w:before="100" w:beforeAutospacing="1" w:after="100" w:afterAutospacing="1" w:line="240" w:lineRule="auto"/>
-        <w:rPr>
-          <w:rFonts w:ascii="Arial" w:eastAsia="Times New Roman" w:hAnsi="Arial" w:cs="Arial"/>
-          <w:kern w:val="0"/>
-          <w:lang w:eastAsia="pt-BR"/>
-          <w14:ligatures w14:val="none"/>
-        </w:rPr>
-      </w:pPr>
-      <w:r>
-        <w:rPr>
-          <w:rFonts w:ascii="Arial" w:eastAsia="Times New Roman" w:hAnsi="Arial" w:cs="Arial"/>
-          <w:b/>
-          <w:bCs/>
-          <w:kern w:val="0"/>
-          <w:lang w:eastAsia="pt-BR"/>
-          <w14:ligatures w14:val="none"/>
-        </w:rPr>
-        <w:t>Duração média:</w:t>
-      </w:r>
-      <w:r>
-        <w:rPr>
-          <w:rFonts w:ascii="Arial" w:eastAsia="Times New Roman" w:hAnsi="Arial" w:cs="Arial"/>
-          <w:kern w:val="0"/>
-          <w:lang w:eastAsia="pt-BR"/>
-          <w14:ligatures w14:val="none"/>
-        </w:rPr>
-        <w:br/>
-        <w:t>Tempo estimado de gameplay.</w:t>
+        <w:t>Duração médi</w:t>
+      </w:r>
+      <w:r>
+        <w:rPr>
+          <w:rFonts w:ascii="Arial" w:eastAsia="Times New Roman" w:hAnsi="Arial" w:cs="Arial"/>
+          <w:b/>
+          <w:bCs/>
+          <w:kern w:val="0"/>
+          <w:lang w:eastAsia="pt-BR"/>
+          <w14:ligatures w14:val="none"/>
+        </w:rPr>
+        <w:t>a: 2 minutos.</w:t>
       </w:r>
     </w:p>
     <w:p>
@@ -921,7 +1301,7 @@
           <w:lang w:eastAsia="pt-BR"/>
         </w:rPr>
         <w:pict w14:anchorId="3A03F87E">
-          <v:rect id="_x0000_i1026" alt="" style="width:425.2pt;height:.05pt;mso-width-percent:0;mso-height-percent:0;mso-width-percent:0;mso-height-percent:0" o:hralign="center" o:hrstd="t" o:hr="t" fillcolor="#a0a0a0" stroked="f"/>
+          <v:rect id="_x0000_i1029" alt="" style="width:425.2pt;height:.05pt;mso-width-percent:0;mso-height-percent:0;mso-width-percent:0;mso-height-percent:0" o:hralign="center" o:hrstd="t" o:hr="t" fillcolor="#a0a0a0" stroked="f"/>
         </w:pict>
       </w:r>
     </w:p>
@@ -1010,7 +1390,25 @@
           <w:lang w:eastAsia="pt-BR"/>
           <w14:ligatures w14:val="none"/>
         </w:rPr>
-        <w:t xml:space="preserve">Barra de vida </w:t>
+        <w:t>Barra</w:t>
+      </w:r>
+      <w:r>
+        <w:rPr>
+          <w:rFonts w:ascii="Arial" w:eastAsia="Times New Roman" w:hAnsi="Arial" w:cs="Arial"/>
+          <w:kern w:val="0"/>
+          <w:lang w:eastAsia="pt-BR"/>
+          <w14:ligatures w14:val="none"/>
+        </w:rPr>
+        <w:t xml:space="preserve"> de combustível</w:t>
+      </w:r>
+      <w:r>
+        <w:rPr>
+          <w:rFonts w:ascii="Arial" w:eastAsia="Times New Roman" w:hAnsi="Arial" w:cs="Arial"/>
+          <w:kern w:val="0"/>
+          <w:lang w:eastAsia="pt-BR"/>
+          <w14:ligatures w14:val="none"/>
+        </w:rPr>
+        <w:t xml:space="preserve"> </w:t>
       </w:r>
     </w:p>
     <w:p>
@@ -1034,7 +1432,7 @@
           <w:lang w:eastAsia="pt-BR"/>
           <w14:ligatures w14:val="none"/>
         </w:rPr>
-        <w:t xml:space="preserve">Pontuação </w:t>
+        <w:t>Barra de sono</w:t>
       </w:r>
     </w:p>
     <w:p>
@@ -1058,7 +1456,7 @@
           <w:lang w:eastAsia="pt-BR"/>
           <w14:ligatures w14:val="none"/>
         </w:rPr>
-        <w:t xml:space="preserve">Mapa / minimapa </w:t>
+        <w:t>Acelerador e freio</w:t>
       </w:r>
     </w:p>
     <w:p>
@@ -1082,6 +1480,30 @@
           <w:lang w:eastAsia="pt-BR"/>
           <w14:ligatures w14:val="none"/>
         </w:rPr>
+        <w:t>Quantidade de alunos coletados</w:t>
+      </w:r>
+    </w:p>
+    <w:p>
+      <w:pPr>
+        <w:numPr>
+          <w:ilvl w:val="0"/>
+          <w:numId w:val="4"/>
+        </w:numPr>
+        <w:spacing w:before="100" w:beforeAutospacing="1" w:after="100" w:afterAutospacing="1" w:line="240" w:lineRule="auto"/>
+        <w:rPr>
+          <w:rFonts w:ascii="Arial" w:eastAsia="Times New Roman" w:hAnsi="Arial" w:cs="Arial"/>
+          <w:kern w:val="0"/>
+          <w:lang w:eastAsia="pt-BR"/>
+          <w14:ligatures w14:val="none"/>
+        </w:rPr>
+      </w:pPr>
+      <w:r>
+        <w:rPr>
+          <w:rFonts w:ascii="Arial" w:eastAsia="Times New Roman" w:hAnsi="Arial" w:cs="Arial"/>
+          <w:kern w:val="0"/>
+          <w:lang w:eastAsia="pt-BR"/>
+          <w14:ligatures w14:val="none"/>
+        </w:rPr>
         <w:t xml:space="preserve">Botões principais </w:t>
       </w:r>
     </w:p>
@@ -1128,7 +1550,7 @@
           <w:lang w:eastAsia="pt-BR"/>
           <w14:ligatures w14:val="none"/>
         </w:rPr>
-        <w:t xml:space="preserve">Teclado / Mouse / Toque </w:t>
+        <w:t>Teclado / Mouse / Toque</w:t>
       </w:r>
     </w:p>
     <w:p>
@@ -1173,7 +1595,7 @@
           <w:lang w:eastAsia="pt-BR"/>
         </w:rPr>
         <w:pict w14:anchorId="437FAFD4">
-          <v:rect id="_x0000_i1025" alt="" style="width:425.2pt;height:.05pt;mso-width-percent:0;mso-height-percent:0;mso-width-percent:0;mso-height-percent:0" o:hralign="center" o:hrstd="t" o:hr="t" fillcolor="#a0a0a0" stroked="f"/>
+          <v:rect id="_x0000_i1030" alt="" style="width:425.2pt;height:.05pt;mso-width-percent:0;mso-height-percent:0;mso-width-percent:0;mso-height-percent:0" o:hralign="center" o:hrstd="t" o:hr="t" fillcolor="#a0a0a0" stroked="f"/>
         </w:pict>
       </w:r>
     </w:p>
@@ -1247,8 +1669,7 @@
           <w:lang w:eastAsia="pt-BR"/>
           <w14:ligatures w14:val="none"/>
         </w:rPr>
-        <w:br/>
-        <w:t>(2D, 3D, pixel art, realista…)</w:t>
+        <w:t xml:space="preserve"> 2D.</w:t>
       </w:r>
     </w:p>
     <w:p>
@@ -1279,8 +1700,45 @@
           <w:lang w:eastAsia="pt-BR"/>
           <w14:ligatures w14:val="none"/>
         </w:rPr>
-        <w:br/>
-        <w:t>Jogos ou estilos semelhantes.</w:t>
+        <w:t xml:space="preserve"> </w:t>
+      </w:r>
+      <w:r>
+        <w:rPr>
+          <w:rFonts w:ascii="Arial" w:eastAsia="Times New Roman" w:hAnsi="Arial" w:cs="Arial"/>
+          <w:kern w:val="0"/>
+          <w:lang w:eastAsia="pt-BR"/>
+          <w14:ligatures w14:val="none"/>
+        </w:rPr>
+        <w:t xml:space="preserve">drive </w:t>
+      </w:r>
+      <w:proofErr w:type="spellStart"/>
+      <w:r>
+        <w:rPr>
+          <w:rFonts w:ascii="Arial" w:eastAsia="Times New Roman" w:hAnsi="Arial" w:cs="Arial"/>
+          <w:kern w:val="0"/>
+          <w:lang w:eastAsia="pt-BR"/>
+          <w14:ligatures w14:val="none"/>
+        </w:rPr>
+        <w:t>simulator</w:t>
+      </w:r>
+      <w:proofErr w:type="spellEnd"/>
+      <w:r>
+        <w:rPr>
+          <w:rFonts w:ascii="Arial" w:eastAsia="Times New Roman" w:hAnsi="Arial" w:cs="Arial"/>
+          <w:kern w:val="0"/>
+          <w:lang w:eastAsia="pt-BR"/>
+          <w14:ligatures w14:val="none"/>
+        </w:rPr>
+        <w:t xml:space="preserve">, </w:t>
+      </w:r>
+      <w:r>
+        <w:rPr>
+          <w:rFonts w:ascii="Arial" w:eastAsia="Times New Roman" w:hAnsi="Arial" w:cs="Arial"/>
+          <w:kern w:val="0"/>
+          <w:lang w:eastAsia="pt-BR"/>
+          <w14:ligatures w14:val="none"/>
+        </w:rPr>
+        <w:t>vida real.</w:t>
       </w:r>
     </w:p>
     <w:p>
@@ -1302,6 +1760,7 @@
           <w:lang w:eastAsia="pt-BR"/>
           <w14:ligatures w14:val="none"/>
         </w:rPr>
+        <w:lastRenderedPageBreak/>
         <w:t>Áudio:</w:t>
       </w:r>
     </w:p>
@@ -1326,8 +1785,28 @@
           <w:lang w:eastAsia="pt-BR"/>
           <w14:ligatures w14:val="none"/>
         </w:rPr>
-        <w:t xml:space="preserve">Música (tema, estilo) </w:t>
-      </w:r>
+        <w:t>Música</w:t>
+      </w:r>
+      <w:r>
+        <w:rPr>
+          <w:rFonts w:ascii="Arial" w:eastAsia="Times New Roman" w:hAnsi="Arial" w:cs="Arial"/>
+          <w:kern w:val="0"/>
+          <w:lang w:eastAsia="pt-BR"/>
+          <w14:ligatures w14:val="none"/>
+        </w:rPr>
+        <w:t xml:space="preserve">: </w:t>
+      </w:r>
+      <w:proofErr w:type="spellStart"/>
+      <w:r>
+        <w:rPr>
+          <w:rFonts w:ascii="Arial" w:eastAsia="Times New Roman" w:hAnsi="Arial" w:cs="Arial"/>
+          <w:kern w:val="0"/>
+          <w:lang w:eastAsia="pt-BR"/>
+          <w14:ligatures w14:val="none"/>
+        </w:rPr>
+        <w:t>soundtrack</w:t>
+      </w:r>
+      <w:proofErr w:type="spellEnd"/>
     </w:p>
     <w:p>
       <w:pPr>
@@ -1350,7 +1829,16 @@
           <w:lang w:eastAsia="pt-BR"/>
           <w14:ligatures w14:val="none"/>
         </w:rPr>
-        <w:t xml:space="preserve">Efeitos sonoros (ações, ambiente) </w:t>
+        <w:t>Efeitos sonoros</w:t>
+      </w:r>
+      <w:r>
+        <w:rPr>
+          <w:rFonts w:ascii="Arial" w:eastAsia="Times New Roman" w:hAnsi="Arial" w:cs="Arial"/>
+          <w:kern w:val="0"/>
+          <w:lang w:eastAsia="pt-BR"/>
+          <w14:ligatures w14:val="none"/>
+        </w:rPr>
+        <w:t>: motor, freio, checkpoint, aceleração</w:t>
       </w:r>
     </w:p>
     <w:p>
@@ -1371,7 +1859,7 @@
 </file>
 
 <file path=word/numbering.xml><?xml version="1.0" encoding="utf-8"?>
-<w:numbering xmlns:wpc="http://schemas.microsoft.com/office/word/2010/wordprocessingCanvas" xmlns:cx="http://schemas.microsoft.com/office/drawing/2014/chartex" xmlns:cx1="http://schemas.microsoft.com/office/drawing/2015/9/8/chartex" xmlns:cx2="http://schemas.microsoft.com/office/drawing/2015/10/21/chartex" xmlns:cx3="http://schemas.microsoft.com/office/drawing/2016/5/9/chartex" xmlns:cx4="http://schemas.microsoft.com/office/drawing/2016/5/10/chartex" xmlns:cx5="http://schemas.microsoft.com/office/drawing/2016/5/11/chartex" xmlns:cx6="http://schemas.microsoft.com/office/drawing/2016/5/12/chartex" xmlns:cx7="http://schemas.microsoft.com/office/drawing/2016/5/13/chartex" xmlns:cx8="http://schemas.microsoft.com/office/drawing/2016/5/14/chartex" xmlns:mc="http://schemas.openxmlformats.org/markup-compatibility/2006" xmlns:aink="http://schemas.microsoft.com/office/drawing/2016/ink" xmlns:am3d="http://schemas.microsoft.com/office/drawing/2017/model3d" xmlns:o="urn:schemas-microsoft-com:office:office" xmlns:oel="http://schemas.microsoft.com/office/2019/extlst" xmlns:r="http://schemas.openxmlformats.org/officeDocument/2006/relationships" xmlns:m="http://schemas.openxmlformats.org/officeDocument/2006/math" xmlns:v="urn:schemas-microsoft-com:vml" xmlns:wp14="http://schemas.microsoft.com/office/word/2010/wordprocessingDrawing" xmlns:wp="http://schemas.openxmlformats.org/drawingml/2006/wordprocessingDrawing" xmlns:w10="urn:schemas-microsoft-com:office:word" xmlns:w="http://schemas.openxmlformats.org/wordprocessingml/2006/main" xmlns:w14="http://schemas.microsoft.com/office/word/2010/wordml" xmlns:w15="http://schemas.microsoft.com/office/word/2012/wordml" xmlns:w16cex="http://schemas.microsoft.com/office/word/2018/wordml/cex" xmlns:w16cid="http://schemas.microsoft.com/office/word/2016/wordml/cid" xmlns:w16="http://schemas.microsoft.com/office/word/2018/wordml" xmlns:w16du="http://schemas.microsoft.com/office/word/2023/wordml/word16du" xmlns:w16sdtdh="http://schemas.microsoft.com/office/word/2020/wordml/sdtdatahash" xmlns:w16sdtfl="http://schemas.microsoft.com/office/word/2024/wordml/sdtformatlock" xmlns:w16se="http://schemas.microsoft.com/office/word/2015/wordml/symex" xmlns:wpg="http://schemas.microsoft.com/office/word/2010/wordprocessingGroup" xmlns:wpi="http://schemas.microsoft.com/office/word/2010/wordprocessingInk" xmlns:wne="http://schemas.microsoft.com/office/word/2006/wordml" xmlns:wps="http://schemas.microsoft.com/office/word/2010/wordprocessingShape" mc:Ignorable="w14 w15 w16se w16cid w16 w16cex w16sdtdh w16sdtfl w16du wp14">
+<w:numbering xmlns:wpc="http://schemas.microsoft.com/office/word/2010/wordprocessingCanvas" xmlns:cx="http://schemas.microsoft.com/office/drawing/2014/chartex" xmlns:cx1="http://schemas.microsoft.com/office/drawing/2015/9/8/chartex" xmlns:cx2="http://schemas.microsoft.com/office/drawing/2015/10/21/chartex" xmlns:cx3="http://schemas.microsoft.com/office/drawing/2016/5/9/chartex" xmlns:cx4="http://schemas.microsoft.com/office/drawing/2016/5/10/chartex" xmlns:cx5="http://schemas.microsoft.com/office/drawing/2016/5/11/chartex" xmlns:cx6="http://schemas.microsoft.com/office/drawing/2016/5/12/chartex" xmlns:cx7="http://schemas.microsoft.com/office/drawing/2016/5/13/chartex" xmlns:cx8="http://schemas.microsoft.com/office/drawing/2016/5/14/chartex" xmlns:mc="http://schemas.openxmlformats.org/markup-compatibility/2006" xmlns:aink="http://schemas.microsoft.com/office/drawing/2016/ink" xmlns:am3d="http://schemas.microsoft.com/office/drawing/2017/model3d" xmlns:o="urn:schemas-microsoft-com:office:office" xmlns:oel="http://schemas.microsoft.com/office/2019/extlst" xmlns:r="http://schemas.openxmlformats.org/officeDocument/2006/relationships" xmlns:m="http://schemas.openxmlformats.org/officeDocument/2006/math" xmlns:v="urn:schemas-microsoft-com:vml" xmlns:wp14="http://schemas.microsoft.com/office/word/2010/wordprocessingDrawing" xmlns:wp="http://schemas.openxmlformats.org/drawingml/2006/wordprocessingDrawing" xmlns:w10="urn:schemas-microsoft-com:office:word" xmlns:w="http://schemas.openxmlformats.org/wordprocessingml/2006/main" xmlns:w14="http://schemas.microsoft.com/office/word/2010/wordml" xmlns:w15="http://schemas.microsoft.com/office/word/2012/wordml" xmlns:w16cex="http://schemas.microsoft.com/office/word/2018/wordml/cex" xmlns:w16cid="http://schemas.microsoft.com/office/word/2016/wordml/cid" xmlns:w16="http://schemas.microsoft.com/office/word/2018/wordml" xmlns:w16sdtdh="http://schemas.microsoft.com/office/word/2020/wordml/sdtdatahash" xmlns:w16se="http://schemas.microsoft.com/office/word/2015/wordml/symex" xmlns:wpg="http://schemas.microsoft.com/office/word/2010/wordprocessingGroup" xmlns:wpi="http://schemas.microsoft.com/office/word/2010/wordprocessingInk" xmlns:wne="http://schemas.microsoft.com/office/word/2006/wordml" xmlns:wps="http://schemas.microsoft.com/office/word/2010/wordprocessingShape" mc:Ignorable="w14 w15 w16se w16cid w16 w16cex w16sdtdh wp14">
   <w:abstractNum w:abstractNumId="0" w15:restartNumberingAfterBreak="0">
     <w:nsid w:val="05315150"/>
     <w:multiLevelType w:val="multilevel"/>
@@ -2288,7 +2776,7 @@
 </file>
 
 <file path=word/styles.xml><?xml version="1.0" encoding="utf-8"?>
-<w:styles xmlns:mc="http://schemas.openxmlformats.org/markup-compatibility/2006" xmlns:r="http://schemas.openxmlformats.org/officeDocument/2006/relationships" xmlns:w="http://schemas.openxmlformats.org/wordprocessingml/2006/main" xmlns:w14="http://schemas.microsoft.com/office/word/2010/wordml" xmlns:w15="http://schemas.microsoft.com/office/word/2012/wordml" xmlns:w16cex="http://schemas.microsoft.com/office/word/2018/wordml/cex" xmlns:w16cid="http://schemas.microsoft.com/office/word/2016/wordml/cid" xmlns:w16="http://schemas.microsoft.com/office/word/2018/wordml" xmlns:w16du="http://schemas.microsoft.com/office/word/2023/wordml/word16du" xmlns:w16sdtdh="http://schemas.microsoft.com/office/word/2020/wordml/sdtdatahash" xmlns:w16sdtfl="http://schemas.microsoft.com/office/word/2024/wordml/sdtformatlock" xmlns:w16se="http://schemas.microsoft.com/office/word/2015/wordml/symex" mc:Ignorable="w14 w15 w16se w16cid w16 w16cex w16sdtdh w16sdtfl w16du">
+<w:styles xmlns:mc="http://schemas.openxmlformats.org/markup-compatibility/2006" xmlns:r="http://schemas.openxmlformats.org/officeDocument/2006/relationships" xmlns:w="http://schemas.openxmlformats.org/wordprocessingml/2006/main" xmlns:w14="http://schemas.microsoft.com/office/word/2010/wordml" xmlns:w15="http://schemas.microsoft.com/office/word/2012/wordml" xmlns:w16cex="http://schemas.microsoft.com/office/word/2018/wordml/cex" xmlns:w16cid="http://schemas.microsoft.com/office/word/2016/wordml/cid" xmlns:w16="http://schemas.microsoft.com/office/word/2018/wordml" xmlns:w16sdtdh="http://schemas.microsoft.com/office/word/2020/wordml/sdtdatahash" xmlns:w16se="http://schemas.microsoft.com/office/word/2015/wordml/symex" mc:Ignorable="w14 w15 w16se w16cid w16 w16cex w16sdtdh">
   <w:docDefaults>
     <w:rPrDefault>
       <w:rPr>
@@ -2889,7 +3377,6 @@
   <w:style w:type="character" w:default="1" w:styleId="Fontepargpadro">
     <w:name w:val="Default Paragraph Font"/>
     <w:uiPriority w:val="1"/>
-    <w:semiHidden/>
     <w:unhideWhenUsed/>
   </w:style>
   <w:style w:type="table" w:default="1" w:styleId="Tabelanormal">

</xml_diff>